<commit_message>
Allowlist-only application access with real accounts
Co-Authored-By: Claude Sonnet 5.5 <noreply@anthropic.com>
</commit_message>
<xml_diff>
--- a/video_first_card_room_product_spec.docx
+++ b/video_first_card_room_product_spec.docx
@@ -701,7 +701,7 @@
         <w:spacing w:after="40"/>
       </w:pPr>
       <w:r>
-        <w:t>Open private invite URL or enter room code.</w:t>
+        <w:t>Sign in (approved people only), then open the room link or pick the room from inside the app.</w:t>
       </w:r>
     </w:p>
     <w:p>
@@ -710,7 +710,7 @@
         <w:spacing w:after="40"/>
       </w:pPr>
       <w:r>
-        <w:t>Enter display name.</w:t>
+        <w:t>Confirm display name.</w:t>
       </w:r>
     </w:p>
     <w:p>
@@ -2687,7 +2687,7 @@
         <w:spacing w:after="40"/>
       </w:pPr>
       <w:r>
-        <w:t>Debt stays with the guest identity until the room closes, then voids. A lender may forgive debt via a no-movement ledger entry. Corrections are compensating transactions only.</w:t>
+        <w:t>Debt stays with the user until the room closes, then voids. A lender may forgive debt via a no-movement ledger entry. Corrections are compensating transactions only.</w:t>
       </w:r>
     </w:p>
     <w:p>
@@ -3023,7 +3023,7 @@
           </w:tcPr>
           <w:p>
             <w:r>
-              <w:t>Rooms, users/guests, hands, transactions, debts, settings</w:t>
+              <w:t>Rooms, users (allowlist), hands, transactions, debts, settings</w:t>
             </w:r>
           </w:p>
         </w:tc>
@@ -3692,7 +3692,7 @@
         <w:spacing w:after="40"/>
       </w:pPr>
       <w:r>
-        <w:t>Use secure invite tokens or sufficiently unpredictable room codes.</w:t>
+        <w:t>Restrict the application to an owner-managed allowlist of approved people; room links work only for signed-in approved users.</w:t>
       </w:r>
     </w:p>
     <w:p>
@@ -3718,7 +3718,7 @@
         <w:spacing w:after="40"/>
       </w:pPr>
       <w:r>
-        <w:t>Guest identity is a 256-bit random token in an httpOnly secure cookie bound to one participant in one room. Display name is never identity. Kick revokes the token for 10 minutes.</w:t>
+        <w:t>Access is allowlist-only: approved people sign in with real accounts (Google OAuth restricted to allowlisted emails) and keep a server-side session. Display name is never identity. Kick blocks the user from that room for 10 minutes.</w:t>
       </w:r>
     </w:p>
     <w:p>
@@ -4278,7 +4278,7 @@
           </w:tcPr>
           <w:p>
             <w:r>
-              <w:t>Guest tokens, invite links, room lifecycle, host controls, spectators. Exit: Join, reconnect and kick tests pass.</w:t>
+              <w:t>Allowlist, Google sign-in, sessions, room lifecycle, host controls, spectators. Exit: Non-allowlisted sign-in refused; session reconnect and kick tests pass.</w:t>
             </w:r>
           </w:p>
         </w:tc>

</xml_diff>